<commit_message>
docs: update week 3 through 7 deliverables
</commit_message>
<xml_diff>
--- a/Week 3/Assignment 3/MaldonadoJDDS8555-3.docx
+++ b/Week 3/Assignment 3/MaldonadoJDDS8555-3.docx
@@ -86,12 +86,13 @@
           <w:b w:val="0"/>
           <w:i w:val="0"/>
         </w:rPr>
-        <w:t>May 23, 2026</w:t>
+        <w:t>June 07, 2026</w:t>
       </w:r>
     </w:p>
     <w:p>
       <w:pPr>
         <w:sectPr>
+          <w:headerReference w:type="default" r:id="rId9"/>
           <w:pgSz w:w="12240" w:h="15840"/>
           <w:pgMar w:top="1440" w:right="1440" w:bottom="1440" w:left="1440" w:header="720" w:footer="720" w:gutter="0"/>
           <w:cols w:space="720"/>
@@ -135,7 +136,7 @@
           <w:b w:val="0"/>
           <w:i w:val="0"/>
         </w:rPr>
-        <w:t>This assignment treated model selection as a balance between predictive accuracy and stability.  Best subset selection has the lowest training RSS for a fixed model size because it searches the full model space, but that does not guarantee the lowest test RSS.  The simulated polynomial exercise showed the same point in practice: selection methods can recover real signal, but they can also include extra terms when the sample is noisy.</w:t>
+        <w:t>This assignment treated model selection as a balance between predictive accuracy and stability.  Best subset selection has the lowest training RSS for a fixed model size because it searches the full model space, but that does not guarantee the lowest test RSS.  The simulated polynomial exercise showed the same point in practice: forward selection and lasso can recover the true polynomial signal, but they can also retain extra terms when the sample is noisy.</w:t>
       </w:r>
     </w:p>
     <w:p>
@@ -148,7 +149,7 @@
           <w:b/>
           <w:i w:val="0"/>
         </w:rPr>
-        <w:t>Model Interpretation</w:t>
+        <w:t>Regularization and PCR</w:t>
       </w:r>
     </w:p>
     <w:p>
@@ -161,7 +162,20 @@
           <w:b w:val="0"/>
           <w:i w:val="0"/>
         </w:rPr>
-        <w:t>For the Abalone competition, elastic net regression gave a stronger and more interpretable regularized baseline than the PCR ridge model.  PCR reduced the predictor space, but it also moved the interpretation from original variables to components.  The completed Kaggle submissions document both required models, while the notebook keeps the code and validation results visible.</w:t>
+        <w:t>For the Abalone competition, elastic net regression gave a stronger and more interpretable regularized baseline than the PCR ridge model.  Elastic net keeps the original predictors visible while shrinking unstable coefficients, so it addresses collinearity without hiding all interpretation.  PCR reduced the predictor space and retained most of the variance, but interpretation moved from original measurements to components.  This tradeoff is expected because PCA is designed to summarize variance rather than directly optimize target prediction (Jolliffe, 2002).</w:t>
+      </w:r>
+    </w:p>
+    <w:p>
+      <w:pPr>
+        <w:spacing w:line="480" w:lineRule="auto"/>
+        <w:jc w:val="center"/>
+      </w:pPr>
+      <w:r>
+        <w:rPr>
+          <w:b/>
+          <w:i w:val="0"/>
+        </w:rPr>
+        <w:t>Assumptions and Evidence</w:t>
       </w:r>
     </w:p>
     <w:p>
@@ -174,7 +188,20 @@
           <w:b w:val="0"/>
           <w:i w:val="0"/>
         </w:rPr>
-        <w:t>GitHub/code note: The Python notebook is the code artifact for this assignment and is ready to post with the submission.  The report is constrained to one page plus Python notebook, so the notebook carries the detailed output, diagnostics, and submission evidence.</w:t>
+        <w:t>The assumption investigation focused on multicollinearity, residual structure, validation performance, and the competition metric.  The Abalone measures are physically related, so shrinkage is appropriate for the regularized model, while PCR provides a dimensionality-reduction comparison.  The completed Kaggle submissions documented elastic net with public/private scores of 0.16444/0.16373 and PCR ridge with public/private scores of 0.18220/0.18228.  The public repository is `https://github.com/maldo81/dds-8555-predictive-analysis`, and the notebook path is `Week 3/Assignment 3/MaldonadoJDDS8555-3.ipynb`.</w:t>
+      </w:r>
+    </w:p>
+    <w:p>
+      <w:pPr>
+        <w:spacing w:line="480" w:lineRule="auto" w:after="0"/>
+        <w:ind w:firstLine="720"/>
+      </w:pPr>
+      <w:r>
+        <w:rPr>
+          <w:b w:val="0"/>
+          <w:i w:val="0"/>
+        </w:rPr>
+        <w:t>GitHub/code note: The Python notebook is the code artifact for this assignment and is ready to post with the submission.  The assignment prompt gives one page plus Python notebook as the length guidance, and the notebook carries the detailed output, diagnostics, and submission evidence.</w:t>
       </w:r>
     </w:p>
     <w:p>
@@ -224,6 +251,15 @@
         <w:ind w:left="720" w:hanging="720"/>
       </w:pPr>
       <w:r>
+        <w:t>Nash, W.  J., Sellers, T.  L., Talbot, S.  R., Cawthorn, A.  J., &amp; Ford, W.  B. (1994).  The population biology of abalone (Haliotis species) in Tasmania.  I.  Blacklip abalone (H. rubra) from the north coast and islands of Bass Strait (Technical Report No.  48).  Sea Fisheries Division.</w:t>
+      </w:r>
+    </w:p>
+    <w:p>
+      <w:pPr>
+        <w:spacing w:line="480" w:lineRule="auto"/>
+        <w:ind w:left="720" w:hanging="720"/>
+      </w:pPr>
+      <w:r>
         <w:t>Tibshirani, R. (1996).  Regression shrinkage and selection via the lasso.  Journal of the Royal Statistical Society: Series B, 58(1), 267-288. https://doi.org/10.1111/j.2517-6161.1996.tb02080.x</w:t>
       </w:r>
     </w:p>
@@ -235,6 +271,22 @@
     </w:sectPr>
   </w:body>
 </w:document>
+</file>
+
+<file path=word/header1.xml><?xml version="1.0" encoding="utf-8"?>
+<w:hdr xmlns:m="http://schemas.openxmlformats.org/officeDocument/2006/math" xmlns:mc="http://schemas.openxmlformats.org/markup-compatibility/2006" xmlns:mo="http://schemas.microsoft.com/office/mac/office/2008/main" xmlns:mv="urn:schemas-microsoft-com:mac:vml" xmlns:o="urn:schemas-microsoft-com:office:office" xmlns:r="http://schemas.openxmlformats.org/officeDocument/2006/relationships" xmlns:v="urn:schemas-microsoft-com:vml" xmlns:w10="urn:schemas-microsoft-com:office:word" xmlns:w14="http://schemas.microsoft.com/office/word/2010/wordml" xmlns:w="http://schemas.openxmlformats.org/wordprocessingml/2006/main" xmlns:wne="http://schemas.microsoft.com/office/word/2006/wordml" xmlns:wp14="http://schemas.microsoft.com/office/word/2010/wordprocessingDrawing" xmlns:wp="http://schemas.openxmlformats.org/drawingml/2006/wordprocessingDrawing" xmlns:wpc="http://schemas.microsoft.com/office/word/2010/wordprocessingCanvas" xmlns:wpg="http://schemas.microsoft.com/office/word/2010/wordprocessingGroup" xmlns:wpi="http://schemas.microsoft.com/office/word/2010/wordprocessingInk" xmlns:wps="http://schemas.microsoft.com/office/word/2010/wordprocessingShape" mc:Ignorable="w14 wp14">
+  <w:p>
+    <w:pPr>
+      <w:pStyle w:val="Header"/>
+      <w:jc w:val="right"/>
+    </w:pPr>
+    <w:r>
+      <w:fldChar w:fldCharType="begin"/>
+      <w:instrText xml:space="preserve">PAGE</w:instrText>
+      <w:fldChar w:fldCharType="end"/>
+    </w:r>
+  </w:p>
+</w:hdr>
 </file>
 
 <file path=word/numbering.xml><?xml version="1.0" encoding="utf-8"?>

</xml_diff>

<commit_message>
docs: align DDS-8555 assignment 3 deliverables
</commit_message>
<xml_diff>
--- a/Week 3/Assignment 3/MaldonadoJDDS8555-3.docx
+++ b/Week 3/Assignment 3/MaldonadoJDDS8555-3.docx
@@ -162,7 +162,7 @@
           <w:b w:val="0"/>
           <w:i w:val="0"/>
         </w:rPr>
-        <w:t>The simulated polynomial exercise explicitly generated X, epsilon, and Y = 1 + 2X - 1.5X^2 + 0.75X^3 + epsilon, then compared forward stepwise selection, backward stepwise selection, and lasso using predictors X through X^10.  Mallows' Cp was computed for the forward and backward paths, and the selected coefficients were reported.  Lasso used cross-validation to choose lambda, with the cross-validation error plotted as a function of lambda.  The second simulation changed the true response to Y = 1 + 3X^7 + epsilon, then repeated forward selection and lasso so the notebook could show whether each method recovered the sparse seventh-power signal.</w:t>
+        <w:t>The simulated polynomial exercise explicitly generated X, epsilon, and Y = 1 + 2X - 1.5X^2 + 0.75X^3 + epsilon, then evaluated best subset selection using predictors X through X^10.  The notebook reports Cp, BIC, and adjusted R2 for the best model at each size, plots all three criteria, and reports the selected coefficients for the criterion-winning models.  It then repeats the selection task with forward and backward stepwise paths so the restricted searches can be compared against exhaustive best subset selection.  Lasso used cross-validation to choose lambda, with the cross-validation error plotted as a function of lambda.  The second simulation changed the true response to Y = 1 + 3X^7 + epsilon, then repeated best subset selection and lasso to show whether each method recovered the sparse seventh-power signal.</w:t>
       </w:r>
     </w:p>
     <w:p>
@@ -240,7 +240,7 @@
           <w:b w:val="0"/>
           <w:i w:val="0"/>
         </w:rPr>
-        <w:t>The assumption investigation focused on multicollinearity, residual structure, validation performance, and the competition metric.  The Abalone measures are physically related, so shrinkage is appropriate for the regularized model, while PCR provides a structured way to collapse correlated predictors.  The notebook separates the two Kaggle models, maps each model to its submission file, reports validation RMSLE, and includes Kaggle evidence for both submissions.  The public repository is `https://github.com/maldo81/dds-8555-predictive-analysis`, and the notebook path is `Week 3/Assignment 3/MaldonadoJDDS8555-3.ipynb`.</w:t>
+        <w:t>The assumption investigation now includes visible data-quality checks, multicollinearity diagnostics, validation residual summaries, and residual-vs-fitted plots.  The Abalone quality check verifies expected columns, duplicate IDs, missing values, and invalid physical measurements before modeling.  The VIF table shows why shrinkage and PCR are appropriate: the Abalone shell and weight measures are physically related and therefore highly overlapping.  The residual summaries and plots check whether the elastic net and PCR ridge models show systematic bias or widening errors across fitted ring counts.  The notebook separates the two Kaggle models, maps each model to its submission file, reports validation RMSLE, and includes Kaggle evidence for both submissions.  The public repository is `https://github.com/maldo81/dds-8555-predictive-analysis`, and the notebook path is `Week 3/Assignment 3/MaldonadoJDDS8555-3.ipynb`.</w:t>
       </w:r>
     </w:p>
     <w:p>
@@ -286,6 +286,15 @@
       </w:pPr>
       <w:r>
         <w:t>Hastie, T., Tibshirani, R., &amp; Friedman, J. (2009).  The elements of statistical learning: Data mining, inference, and prediction (2nd ed.).  Springer. https://doi.org/10.1007/978-0-387-84858-7</w:t>
+      </w:r>
+    </w:p>
+    <w:p>
+      <w:pPr>
+        <w:spacing w:line="480" w:lineRule="auto"/>
+        <w:ind w:left="720" w:hanging="720"/>
+      </w:pPr>
+      <w:r>
+        <w:t>James, G., Witten, D., Hastie, T., Tibshirani, R., &amp; Taylor, J. (2023).  An introduction to statistical learning: With applications in Python.  Springer. https://doi.org/10.1007/978-3-031-38747-0</w:t>
       </w:r>
     </w:p>
     <w:p>

</xml_diff>